<commit_message>
Add BantayAralan Feasibility Study (md + docx) and confirm switch/PC hardware specs
</commit_message>
<xml_diff>
--- a/BantayAralan-Prototype-Paper.docx
+++ b/BantayAralan-Prototype-Paper.docx
@@ -1038,6 +1038,32 @@
           <w:sz w:val="24"/>
         </w:rPr>
         <w:t>Computer/Laptop – processes video input and runs the system</w:t>
+      </w:r>
+    </w:p>
+    <w:p>
+      <w:pPr>
+        <w:pStyle w:val="ListBullet"/>
+        <w:spacing w:after="80"/>
+      </w:pPr>
+      <w:r>
+        <w:rPr>
+          <w:rFonts w:ascii="Times New Roman" w:hAnsi="Times New Roman"/>
+          <w:sz w:val="24"/>
+        </w:rPr>
+        <w:t>Network switch – TP-Link TL-SG1005LP, a 5-port Gigabit desktop switch with 4 PoE+ ports and a 40 W total PoE power budget, confirmed for the project's PoE camera(s)</w:t>
+      </w:r>
+    </w:p>
+    <w:p>
+      <w:pPr>
+        <w:pStyle w:val="ListBullet"/>
+        <w:spacing w:after="80"/>
+      </w:pPr>
+      <w:r>
+        <w:rPr>
+          <w:rFonts w:ascii="Times New Roman" w:hAnsi="Times New Roman"/>
+          <w:sz w:val="24"/>
+        </w:rPr>
+        <w:t>Processing PC specification – AMD Ryzen 5 5600 CPU, NVIDIA GeForce RTX 2060 GPU, 16 GB 3200 MHz RAM, a 256 GB M.2 SSD, and a 1 TB HDD, confirmed as the project team's existing processing hardware</w:t>
       </w:r>
     </w:p>
     <w:p>

</xml_diff>